<commit_message>
Organize GitHub view: project_portfolio guide, submission B018 + PDF, README links
- Add project_portfolio/README.md as stakeholder start page (coordinator, supervisor, reproduce steps)
- Add project_portfolio/feedback/ for action-point .doc; optional cursor workflow note
- Move Final Report.pdf to submission/B01821011_Final_Report.pdf; document canonical Word filename
- Update README, docs/README, PROJECT_STRUCTURE, supervisor_package, viva_supervisor materials
- Point final_submission_qa.py at B01821011_Arka_Talukder_Dissertation_Final.docx
- Remove duplicate feedback/Cursor files from docs/reference

Made-with: Cursor
</commit_message>
<xml_diff>
--- a/archive/process_attendance/Arka_Talukder_Process_Documentation_B01821011.docx
+++ b/archive/process_attendance/Arka_Talukder_Process_Documentation_B01821011.docx
@@ -87,6 +87,7 @@
     <w:p/>
     <w:p>
       <w:pPr>
+        <w:ind w:left="720"/>
         <w:rPr>
           <w:b/>
         </w:rPr>
@@ -203,20 +204,22 @@
     </w:p>
     <w:p>
       <w:pPr>
-        <w:rPr>
-          <w:b/>
-        </w:rPr>
-      </w:pPr>
-    </w:p>
-    <w:p>
-      <w:pPr>
-        <w:rPr>
-          <w:b/>
-        </w:rPr>
-      </w:pPr>
-    </w:p>
-    <w:p>
-      <w:pPr>
+        <w:ind w:firstLine="0"/>
+        <w:rPr>
+          <w:b/>
+        </w:rPr>
+      </w:pPr>
+    </w:p>
+    <w:p>
+      <w:pPr>
+        <w:rPr>
+          <w:b/>
+        </w:rPr>
+      </w:pPr>
+    </w:p>
+    <w:p>
+      <w:pPr>
+        <w:ind w:left="720"/>
         <w:rPr>
           <w:b/>
         </w:rPr>
@@ -267,12 +270,6 @@
         <w:rPr>
           <w:b/>
         </w:rPr>
-        <w:tab/>
-      </w:r>
-      <w:r>
-        <w:rPr>
-          <w:b/>
-        </w:rPr>
         <w:t>Date/Time:</w:t>
       </w:r>
       <w:r>
@@ -293,8 +290,6 @@
         </w:rPr>
         <w:t xml:space="preserve">/2026 </w:t>
       </w:r>
-      <w:bookmarkStart w:id="0" w:name="_GoBack"/>
-      <w:bookmarkEnd w:id="0"/>
       <w:r>
         <w:rPr>
           <w:b/>
@@ -307,6 +302,7 @@
     <w:p/>
     <w:p>
       <w:pPr>
+        <w:ind w:left="720"/>
         <w:rPr>
           <w:b/>
           <w:sz w:val="24"/>
@@ -414,6 +410,7 @@
     </w:p>
     <w:p>
       <w:pPr>
+        <w:ind w:left="720"/>
         <w:rPr>
           <w:b/>
           <w:sz w:val="24"/>
@@ -431,17 +428,43 @@
     </w:p>
     <w:p>
       <w:pPr>
-        <w:rPr>
-          <w:sz w:val="24"/>
-          <w:szCs w:val="24"/>
-        </w:rPr>
-      </w:pPr>
-      <w:r>
-        <w:rPr>
-          <w:sz w:val="24"/>
-          <w:szCs w:val="24"/>
-        </w:rPr>
-        <w:t>Across all meetings, the project moved from title selection to interim report completion. On 10 and 11 Fe</w:t>
+        <w:ind w:left="720"/>
+        <w:rPr>
+          <w:sz w:val="24"/>
+          <w:szCs w:val="24"/>
+        </w:rPr>
+      </w:pPr>
+      <w:r>
+        <w:rPr>
+          <w:sz w:val="24"/>
+          <w:szCs w:val="24"/>
+        </w:rPr>
+        <w:t>Across all meetings, the project moved from title selection t</w:t>
+      </w:r>
+      <w:r>
+        <w:rPr>
+          <w:sz w:val="24"/>
+          <w:szCs w:val="24"/>
+        </w:rPr>
+        <w:t>o interim report completion. On</w:t>
+      </w:r>
+    </w:p>
+    <w:p>
+      <w:pPr>
+        <w:ind w:left="720"/>
+        <w:rPr>
+          <w:sz w:val="24"/>
+          <w:szCs w:val="24"/>
+        </w:rPr>
+      </w:pPr>
+      <w:bookmarkStart w:id="0" w:name="_GoBack"/>
+      <w:bookmarkEnd w:id="0"/>
+      <w:r>
+        <w:rPr>
+          <w:sz w:val="24"/>
+          <w:szCs w:val="24"/>
+        </w:rPr>
+        <w:t>10 and 11 Fe</w:t>
       </w:r>
       <w:r>
         <w:rPr>
@@ -1341,31 +1364,31 @@
       <w:lvlText w:val="•"/>
       <w:lvlJc w:val="left"/>
       <w:pPr>
-        <w:ind w:left="-360" w:hanging="360"/>
+        <w:ind w:left="360" w:hanging="360"/>
       </w:pPr>
       <w:rPr>
         <w:rFonts w:ascii="Calibri" w:eastAsiaTheme="minorHAnsi" w:hAnsi="Calibri" w:cs="Calibri" w:hint="default"/>
       </w:rPr>
     </w:lvl>
-    <w:lvl w:ilvl="1" w:tplc="04090003" w:tentative="1">
+    <w:lvl w:ilvl="1" w:tplc="04090003">
       <w:start w:val="1"/>
       <w:numFmt w:val="bullet"/>
       <w:lvlText w:val="o"/>
       <w:lvlJc w:val="left"/>
       <w:pPr>
-        <w:ind w:left="1440" w:hanging="360"/>
+        <w:ind w:left="2160" w:hanging="360"/>
       </w:pPr>
       <w:rPr>
         <w:rFonts w:ascii="Courier New" w:hAnsi="Courier New" w:cs="Courier New" w:hint="default"/>
       </w:rPr>
     </w:lvl>
-    <w:lvl w:ilvl="2" w:tplc="04090005" w:tentative="1">
+    <w:lvl w:ilvl="2" w:tplc="04090005">
       <w:start w:val="1"/>
       <w:numFmt w:val="bullet"/>
       <w:lvlText w:val=""/>
       <w:lvlJc w:val="left"/>
       <w:pPr>
-        <w:ind w:left="2160" w:hanging="360"/>
+        <w:ind w:left="2880" w:hanging="360"/>
       </w:pPr>
       <w:rPr>
         <w:rFonts w:ascii="Wingdings" w:hAnsi="Wingdings" w:hint="default"/>
@@ -1377,7 +1400,7 @@
       <w:lvlText w:val=""/>
       <w:lvlJc w:val="left"/>
       <w:pPr>
-        <w:ind w:left="2880" w:hanging="360"/>
+        <w:ind w:left="3600" w:hanging="360"/>
       </w:pPr>
       <w:rPr>
         <w:rFonts w:ascii="Symbol" w:hAnsi="Symbol" w:hint="default"/>
@@ -1389,7 +1412,7 @@
       <w:lvlText w:val="o"/>
       <w:lvlJc w:val="left"/>
       <w:pPr>
-        <w:ind w:left="3600" w:hanging="360"/>
+        <w:ind w:left="4320" w:hanging="360"/>
       </w:pPr>
       <w:rPr>
         <w:rFonts w:ascii="Courier New" w:hAnsi="Courier New" w:cs="Courier New" w:hint="default"/>
@@ -1401,7 +1424,7 @@
       <w:lvlText w:val=""/>
       <w:lvlJc w:val="left"/>
       <w:pPr>
-        <w:ind w:left="4320" w:hanging="360"/>
+        <w:ind w:left="5040" w:hanging="360"/>
       </w:pPr>
       <w:rPr>
         <w:rFonts w:ascii="Wingdings" w:hAnsi="Wingdings" w:hint="default"/>
@@ -1413,7 +1436,7 @@
       <w:lvlText w:val=""/>
       <w:lvlJc w:val="left"/>
       <w:pPr>
-        <w:ind w:left="5040" w:hanging="360"/>
+        <w:ind w:left="5760" w:hanging="360"/>
       </w:pPr>
       <w:rPr>
         <w:rFonts w:ascii="Symbol" w:hAnsi="Symbol" w:hint="default"/>
@@ -1425,7 +1448,7 @@
       <w:lvlText w:val="o"/>
       <w:lvlJc w:val="left"/>
       <w:pPr>
-        <w:ind w:left="5760" w:hanging="360"/>
+        <w:ind w:left="6480" w:hanging="360"/>
       </w:pPr>
       <w:rPr>
         <w:rFonts w:ascii="Courier New" w:hAnsi="Courier New" w:cs="Courier New" w:hint="default"/>
@@ -1437,7 +1460,7 @@
       <w:lvlText w:val=""/>
       <w:lvlJc w:val="left"/>
       <w:pPr>
-        <w:ind w:left="6480" w:hanging="360"/>
+        <w:ind w:left="7200" w:hanging="360"/>
       </w:pPr>
       <w:rPr>
         <w:rFonts w:ascii="Wingdings" w:hAnsi="Wingdings" w:hint="default"/>

</xml_diff>